<commit_message>
Add field-level AES-256 encryption to complete Phase 0
Isar v3 CE does not support DB-level encryption, so EncryptionHelper
provides field-level AES-256 encryption with keys stored in iOS
Keychain / Android Keystore via flutter_secure_storage. Updated spec
and task docs to reflect the new approach.

Co-Authored-By: Claude Opus 4.6 <noreply@anthropic.com>
</commit_message>
<xml_diff>
--- a/spec/hamsters_stash_spec.docx
+++ b/spec/hamsters_stash_spec.docx
@@ -1075,7 +1075,7 @@
                     <w:szCs w:val="20"/>
                     <w:rtl w:val="0"/>
                   </w:rPr>
-                  <w:t xml:space="preserve">本地加密資料庫，效能優於 SQLite</w:t>
+                  <w:t xml:space="preserve">本地資料庫 + 欄位級 AES-256 加密，效能優於 SQLite</w:t>
                 </w:r>
               </w:sdtContent>
             </w:sdt>
@@ -22582,7 +22582,7 @@
               <w:vertAlign w:val="baseline"/>
               <w:rtl w:val="0"/>
             </w:rPr>
-            <w:t xml:space="preserve">Isar 加密：</w:t>
+            <w:t xml:space="preserve">欄位級加密：</w:t>
           </w:r>
         </w:sdtContent>
       </w:sdt>
@@ -22609,7 +22609,7 @@
               <w:vertAlign w:val="baseline"/>
               <w:rtl w:val="0"/>
             </w:rPr>
-            <w:t xml:space="preserve">啟用 Isar 的內建 AES-256 加密，金鑰存儲於 iOS Keychain / Android Keystore。</w:t>
+            <w:t xml:space="preserve">Isar v3 CE 不支援 DB 層級加密，改用 EncryptionHelper 對敏感欄位（金額、餘額、備註、對象姓名）進行 AES-256 欄位級加密，金鑰存儲於 iOS Keychain / Android Keystore（透過 flutter_secure_storage）。</w:t>
           </w:r>
         </w:sdtContent>
       </w:sdt>
@@ -30144,7 +30144,7 @@
                     <w:szCs w:val="20"/>
                     <w:rtl w:val="0"/>
                   </w:rPr>
-                  <w:t xml:space="preserve">本地加密資料庫</w:t>
+                  <w:t xml:space="preserve">本地資料庫 + 欄位級加密</w:t>
                 </w:r>
               </w:sdtContent>
             </w:sdt>

</xml_diff>